<commit_message>
Corregir header nombre+anios y formato de educacion vs. canon de Paola
Encontrado por Santiago comparando un candidato real (Steven Palmer-Velazquez,
New Format) contra el canon de Yanina M. Castro Delgado:

1. El header de nombre+anios de experiencia usaba una seccion de 2 columnas
   para intentar ponerlos lado a lado -- Word no reparte parrafos cortos
   entre columnas asi, asi que siempre salian en 2 lineas apiladas. Fusionado
   en un solo parrafo con tab stop derecho (mismo mecanismo ya probado en
   company.header), en New Format y Non Template.

2. Educacion nunca separaba grado/institucion en negrita/plano como el canon
   -- format_education_item() armaba un string unico con fecha y viñeta
   Wingdings, ninguno de los cuales aparece en los 6 CVs canon. Nueva
   build_education_entries() devuelve {degree, institution} sin periodo;
   templates editados a 2 parrafos por item, sin viñeta.

Co-Authored-By: Claude Sonnet 5 <noreply@anthropic.com>
</commit_message>
<xml_diff>
--- a/02-modulo2-agente-transformacion/microservicio/templates/anotados/New Format Resume Template.docx
+++ b/02-modulo2-agente-transformacion/microservicio/templates/anotados/New Format Resume Template.docx
@@ -4,26 +4,9 @@
   <w:body>
     <w:p>
       <w:pPr>
-        <w:rPr>
-          <w:rFonts w:ascii="Arial" w:hAnsi="Arial" w:cs="Arial"/>
-          <w:b/>
-          <w:bCs/>
-          <w:sz w:val="20"/>
-          <w:szCs w:val="20"/>
-        </w:rPr>
-      </w:pPr>
-      <w:r>
-        <w:rPr>
-          <w:rFonts w:ascii="Arial" w:hAnsi="Arial"/>
-          <w:b/>
-          <w:sz w:val="20"/>
-        </w:rPr>
-        <w:t>{{ full_name }}</w:t>
-      </w:r>
-    </w:p>
-    <w:p>
-      <w:pPr>
-        <w:jc w:val="right"/>
+        <w:tabs>
+          <w:tab w:val="right" w:pos="9360"/>
+        </w:tabs>
         <w:rPr>
           <w:rFonts w:ascii="Arial" w:hAnsi="Arial" w:cs="Arial"/>
           <w:b/>
@@ -36,10 +19,21 @@
           <w:footerReference w:type="default" r:id="rId9"/>
           <w:pgSz w:w="12240" w:h="15840"/>
           <w:pgMar w:top="1886" w:right="1440" w:bottom="634" w:left="1440" w:header="720" w:footer="331" w:gutter="0"/>
-          <w:cols w:num="2" w:space="720"/>
+          <w:cols w:space="720"/>
           <w:docGrid w:linePitch="360"/>
         </w:sectPr>
       </w:pPr>
+      <w:r>
+        <w:rPr>
+          <w:rFonts w:ascii="Arial" w:hAnsi="Arial"/>
+          <w:b/>
+          <w:sz w:val="20"/>
+        </w:rPr>
+        <w:t>{{ full_name }}</w:t>
+      </w:r>
+      <w:r>
+        <w:tab/>
+      </w:r>
       <w:r>
         <w:rPr>
           <w:rFonts w:ascii="Arial" w:hAnsi="Arial"/>
@@ -133,16 +127,24 @@
       <w:pPr>
         <w:spacing w:after="200"/>
         <w:ind w:left="360" w:hanging="360"/>
-        <w:numPr>
-          <w:ilvl w:val="0"/>
-          <w:numId w:val="9001"/>
-        </w:numPr>
+      </w:pPr>
+      <w:r>
+        <w:rPr>
+          <w:b/>
+        </w:rPr>
+        <w:t>{{ item.degree }}</w:t>
+      </w:r>
+    </w:p>
+    <w:p>
+      <w:pPr>
+        <w:spacing w:after="200"/>
+        <w:ind w:left="360" w:hanging="360"/>
       </w:pPr>
       <w:r>
         <w:rPr>
           <w:b w:val="0"/>
         </w:rPr>
-        <w:t>{{ item }}</w:t>
+        <w:t>{{ item.institution }}</w:t>
       </w:r>
     </w:p>
     <w:p>

</xml_diff>

<commit_message>
Corregir fuente por defecto y bullets invisibles en New Format/Non Template
Encontrado comparando un candidato real (Steven, New Format) contra el
canon de Kenneth: el docDefaults de ambos templates especificaba Times
New Roman en vez de Arial (BD Format ya lo tenia bien), asi que todo el
contenido dinamico sin fuente explicita (summary, bullets, headers de
experiencia, skills) caia a Times New Roman -- solo los titulos de
seccion estaticos tenian Arial explicito.

Ademas, los bullets de experiencia/skills/certificaciones en New Format
usaban una vineta nativa en fuente Wingdings que no se ve si el visor no
tiene esa fuente bien mapeada -- cambiados al mismo guion literal "- "
que ya usan Non Template y BD Format de forma confiable.

Co-Authored-By: Claude Sonnet 5 <noreply@anthropic.com>
</commit_message>
<xml_diff>
--- a/02-modulo2-agente-transformacion/microservicio/templates/anotados/New Format Resume Template.docx
+++ b/02-modulo2-agente-transformacion/microservicio/templates/anotados/New Format Resume Template.docx
@@ -126,7 +126,6 @@
     <w:p>
       <w:pPr>
         <w:spacing w:after="200"/>
-        <w:ind w:left="360" w:hanging="360"/>
       </w:pPr>
       <w:r>
         <w:rPr>
@@ -138,7 +137,6 @@
     <w:p>
       <w:pPr>
         <w:spacing w:after="200"/>
-        <w:ind w:left="360" w:hanging="360"/>
       </w:pPr>
       <w:r>
         <w:rPr>
@@ -341,16 +339,12 @@
       <w:pPr>
         <w:spacing w:after="200"/>
         <w:ind w:left="360" w:hanging="360"/>
-        <w:numPr>
-          <w:ilvl w:val="0"/>
-          <w:numId w:val="9001"/>
-        </w:numPr>
       </w:pPr>
       <w:r>
         <w:rPr>
           <w:b w:val="0"/>
         </w:rPr>
-        <w:t>{{ b }}</w:t>
+        <w:t>- {{ b }}</w:t>
       </w:r>
     </w:p>
     <w:p>
@@ -458,16 +452,12 @@
       <w:pPr>
         <w:spacing w:after="200"/>
         <w:ind w:left="360" w:hanging="360"/>
-        <w:numPr>
-          <w:ilvl w:val="0"/>
-          <w:numId w:val="9001"/>
-        </w:numPr>
       </w:pPr>
       <w:r>
         <w:rPr>
           <w:b w:val="0"/>
         </w:rPr>
-        <w:t>{{ item }}</w:t>
+        <w:t>- {{ item }}</w:t>
       </w:r>
     </w:p>
     <w:p>
@@ -534,16 +524,12 @@
       <w:pPr>
         <w:spacing w:after="200"/>
         <w:ind w:left="360" w:hanging="360"/>
-        <w:numPr>
-          <w:ilvl w:val="0"/>
-          <w:numId w:val="9001"/>
-        </w:numPr>
       </w:pPr>
       <w:r>
         <w:rPr>
           <w:b w:val="0"/>
         </w:rPr>
-        <w:t>{{ item }}</w:t>
+        <w:t>- {{ item }}</w:t>
       </w:r>
     </w:p>
     <w:p>
@@ -5084,7 +5070,7 @@
   <w:docDefaults>
     <w:rPrDefault>
       <w:rPr>
-        <w:rFonts w:ascii="Times New Roman" w:eastAsia="Times New Roman" w:hAnsi="Times New Roman" w:cs="Times New Roman"/>
+        <w:rFonts w:ascii="Arial" w:eastAsia="Arial" w:hAnsi="Arial" w:cs="Arial"/>
         <w:lang w:val="en-US" w:eastAsia="en-US" w:bidi="ar-SA"/>
       </w:rPr>
     </w:rPrDefault>

</xml_diff>

<commit_message>
Corregir espaciado de secciones, alineacion de cargos y bullets nativos
- Nombre en mayusculas en el header (filtro Jinja |upper).
- spacing before/after en titulos de seccion (antes quedaba pegado al
  contenido tras quitar los parrafos en blanco).
- role.header vuelve a x=72 (flush con la empresa, no indentado).
- Bullets: viñeta nativa de Word (numPr) en vez de caracter manual.
- Fechas: raya larga en vez de guion; punto faltante en abreviaturas
  de 2 letras tipo "(B.S)" -> "(B.S.)".
- keepNext en titulos de seccion y en cargo/subcargo.

Co-Authored-By: Claude Sonnet 5 <noreply@anthropic.com>
</commit_message>
<xml_diff>
--- a/02-modulo2-agente-transformacion/microservicio/templates/anotados/New Format Resume Template.docx
+++ b/02-modulo2-agente-transformacion/microservicio/templates/anotados/New Format Resume Template.docx
@@ -29,7 +29,7 @@
           <w:b/>
           <w:sz w:val="20"/>
         </w:rPr>
-        <w:t>{{ full_name }}</w:t>
+        <w:t>{{ full_name|upper }}</w:t>
       </w:r>
       <w:r>
         <w:tab/>
@@ -45,6 +45,7 @@
     </w:p>
     <w:p>
       <w:pPr>
+        <w:spacing w:before="240" w:after="160"/>
         <w:pBdr>
           <w:top w:val="single" w:sz="4" w:space="1" w:color="auto"/>
         </w:pBdr>
@@ -56,6 +57,7 @@
           <w:sz w:val="20"/>
           <w:szCs w:val="20"/>
         </w:rPr>
+        <w:keepNext/>
       </w:pPr>
       <w:r>
         <w:rPr>
@@ -116,6 +118,7 @@
     </w:p>
     <w:p>
       <w:pPr>
+        <w:spacing w:before="240" w:after="160"/>
         <w:pBdr>
           <w:top w:val="single" w:sz="4" w:space="1" w:color="auto"/>
         </w:pBdr>
@@ -127,6 +130,7 @@
           <w:sz w:val="20"/>
           <w:szCs w:val="20"/>
         </w:rPr>
+        <w:keepNext/>
       </w:pPr>
       <w:r>
         <w:rPr>
@@ -154,6 +158,7 @@
     </w:p>
     <w:p>
       <w:pPr>
+        <w:spacing w:before="240" w:after="160"/>
         <w:pBdr>
           <w:top w:val="single" w:sz="4" w:space="1" w:color="auto"/>
         </w:pBdr>
@@ -164,6 +169,7 @@
           <w:sz w:val="20"/>
           <w:szCs w:val="20"/>
         </w:rPr>
+        <w:keepNext/>
       </w:pPr>
       <w:r>
         <w:rPr>
@@ -251,8 +257,8 @@
     </w:p>
     <w:p>
       <w:pPr>
-        <w:spacing w:after="0"/>
-        <w:ind w:left="360" w:firstLine="0"/>
+        <w:spacing w:after="0" w:before="40"/>
+        <w:ind w:left="0" w:firstLine="0"/>
         <w:keepNext/>
       </w:pPr>
       <w:r>
@@ -278,13 +284,15 @@
       <w:pPr>
         <w:spacing w:after="0"/>
         <w:ind w:left="720" w:hanging="360"/>
+        <w:numPr>
+          <w:ilvl w:val="0"/>
+          <w:numId w:val="9001"/>
+        </w:numPr>
       </w:pPr>
       <w:r>
         <w:rPr>
           <w:b w:val="0"/>
         </w:rPr>
-        <w:t>−</w:t>
-        <w:tab/>
         <w:t>{{ b }}</w:t>
       </w:r>
     </w:p>
@@ -326,6 +334,7 @@
     </w:p>
     <w:p>
       <w:pPr>
+        <w:spacing w:before="240" w:after="160"/>
         <w:pBdr>
           <w:top w:val="single" w:sz="4" w:space="1" w:color="auto"/>
         </w:pBdr>
@@ -336,6 +345,7 @@
           <w:sz w:val="20"/>
           <w:szCs w:val="20"/>
         </w:rPr>
+        <w:keepNext/>
       </w:pPr>
       <w:r>
         <w:rPr>
@@ -363,13 +373,15 @@
       <w:pPr>
         <w:spacing w:after="0"/>
         <w:ind w:left="720" w:hanging="360"/>
+        <w:numPr>
+          <w:ilvl w:val="0"/>
+          <w:numId w:val="9001"/>
+        </w:numPr>
       </w:pPr>
       <w:r>
         <w:rPr>
           <w:b w:val="0"/>
         </w:rPr>
-        <w:t>−</w:t>
-        <w:tab/>
         <w:t>{{ item }}</w:t>
       </w:r>
     </w:p>
@@ -387,6 +399,7 @@
     </w:p>
     <w:p>
       <w:pPr>
+        <w:spacing w:before="240" w:after="160"/>
         <w:pBdr>
           <w:top w:val="single" w:sz="4" w:space="1" w:color="auto"/>
         </w:pBdr>
@@ -397,6 +410,7 @@
           <w:sz w:val="20"/>
           <w:szCs w:val="20"/>
         </w:rPr>
+        <w:keepNext/>
       </w:pPr>
       <w:r>
         <w:rPr>
@@ -425,13 +439,15 @@
       <w:pPr>
         <w:spacing w:after="0"/>
         <w:ind w:left="720" w:hanging="360"/>
+        <w:numPr>
+          <w:ilvl w:val="0"/>
+          <w:numId w:val="9001"/>
+        </w:numPr>
       </w:pPr>
       <w:r>
         <w:rPr>
           <w:b w:val="0"/>
         </w:rPr>
-        <w:t>−</w:t>
-        <w:tab/>
         <w:t>{{ item }}</w:t>
       </w:r>
     </w:p>
@@ -4851,13 +4867,13 @@
     <w:lvl w:ilvl="0">
       <w:start w:val="1"/>
       <w:numFmt w:val="bullet"/>
-      <w:lvlText w:val=""/>
-      <w:lvlJc w:val="left"/>
-      <w:pPr>
-        <w:ind w:left="360" w:hanging="360"/>
-      </w:pPr>
-      <w:rPr>
-        <w:rFonts w:ascii="Wingdings" w:hAnsi="Wingdings" w:hint="default"/>
+      <w:lvlText w:val="−"/>
+      <w:lvlJc w:val="left"/>
+      <w:pPr>
+        <w:ind w:left="720" w:hanging="360"/>
+      </w:pPr>
+      <w:rPr>
+        <w:rFonts w:ascii="Arial" w:hAnsi="Arial" w:hint="default"/>
       </w:rPr>
     </w:lvl>
   </w:abstractNum>

</xml_diff>

<commit_message>
Restaurar separacion entre empresas distintas en PROFESSIONAL EXPERIENCE
El fix del parrafo fantasma (commit anterior) elimino correctamente el
espacio entre empresa y su primer cargo, pero de paso dejo sin separacion
alguna entre una experiencia laboral y la siguiente. Se mueve el espacio
de "despues del titulo de seccion" a "antes de cada company.header"
(spacing-before 120), reduciendo el spacing-after del titulo de seccion
a 40 para que el hueco antes de la primera empresa siga igual de grande
que antes (40+120=160, igual que EDUCATION/SKILLS/etc).

Co-Authored-By: Claude Sonnet 5 <noreply@anthropic.com>
</commit_message>
<xml_diff>
--- a/02-modulo2-agente-transformacion/microservicio/templates/anotados/New Format Resume Template.docx
+++ b/02-modulo2-agente-transformacion/microservicio/templates/anotados/New Format Resume Template.docx
@@ -158,7 +158,7 @@
     </w:p>
     <w:p>
       <w:pPr>
-        <w:spacing w:before="240" w:after="160"/>
+        <w:spacing w:before="240" w:after="40"/>
         <w:pBdr>
           <w:top w:val="single" w:sz="4" w:space="1" w:color="auto"/>
         </w:pBdr>
@@ -229,7 +229,7 @@
         <w:tabs>
           <w:tab w:pos="9360" w:val="right"/>
         </w:tabs>
-        <w:spacing w:after="0"/>
+        <w:spacing w:after="0" w:before="120"/>
         <w:ind w:left="0" w:firstLine="0"/>
         <w:keepNext/>
       </w:pPr>

</xml_diff>

<commit_message>
Ajustes finos: cargo pegado a empresa, separacion entre estudios, SKILLS unido
- role.header vuelve a 0 espacio antes (empresa+cargo en lineas consecutivas).
- Separacion entre estudios distintos en EDUCATION (no dentro del mismo
  estudio): spacing-before en item.degree, compensado reduciendo el
  spacing-after del titulo EDUCATION para no duplicar el hueco inicial.
- keepNext + keepLines en cada bullet de SKILLS/CERTIFICATIONS para que
  la lista completa se mueva de pagina junto con su titulo, sin partirse.
- Normalizacion de texto: rango con "%" usa raya larga ("15-20%" ->
  "15–20%"), coma antes de "Thesis:" tras un GPA pasa a punto.

Co-Authored-By: Claude Sonnet 5 <noreply@anthropic.com>
</commit_message>
<xml_diff>
--- a/02-modulo2-agente-transformacion/microservicio/templates/anotados/New Format Resume Template.docx
+++ b/02-modulo2-agente-transformacion/microservicio/templates/anotados/New Format Resume Template.docx
@@ -45,7 +45,7 @@
     </w:p>
     <w:p>
       <w:pPr>
-        <w:spacing w:before="240" w:after="160"/>
+        <w:spacing w:before="240" w:after="40"/>
         <w:pBdr>
           <w:top w:val="single" w:sz="4" w:space="1" w:color="auto"/>
         </w:pBdr>
@@ -84,7 +84,7 @@
     </w:p>
     <w:p>
       <w:pPr>
-        <w:spacing w:after="0"/>
+        <w:spacing w:after="0" w:before="120"/>
       </w:pPr>
       <w:r>
         <w:rPr>
@@ -254,7 +254,7 @@
     </w:p>
     <w:p>
       <w:pPr>
-        <w:spacing w:after="0" w:before="40"/>
+        <w:spacing w:after="0" w:before="0"/>
         <w:ind w:left="0" w:firstLine="0"/>
         <w:keepNext/>
       </w:pPr>
@@ -374,6 +374,8 @@
           <w:ilvl w:val="0"/>
           <w:numId w:val="9001"/>
         </w:numPr>
+        <w:keepNext/>
+        <w:keepLines/>
       </w:pPr>
       <w:r>
         <w:rPr>
@@ -440,6 +442,8 @@
           <w:ilvl w:val="0"/>
           <w:numId w:val="9001"/>
         </w:numPr>
+        <w:keepNext/>
+        <w:keepLines/>
       </w:pPr>
       <w:r>
         <w:rPr>

</xml_diff>

<commit_message>
Columna real de fechas por cargo + 3 niveles de spacing + interlineado 1.15
- Fecha de cargo ya no va entre parentesis pegada al titulo -- ahora usa
  el mismo tab stop derecho (x=540pt) que company.header, en una columna
  real alineada con las fechas de empresa. role.header se separa en dos
  variantes (Jinja {% if loop.first %}) porque el primer cargo de una
  empresa necesita antes=0 (pegado a la empresa) y los subcargos
  siguientes necesitan antes=120 (nivel C, subcargo a subcargo).
- Interlineado 1.15 en el estilo Normal (cascada a todo el documento).
- 3 niveles de spacing explicitos: bullets after=40 (B), subcargos
  before=120 (C), empresas before=240 (D, subido de 120).

Co-Authored-By: Claude Sonnet 5 <noreply@anthropic.com>
</commit_message>
<xml_diff>
--- a/02-modulo2-agente-transformacion/microservicio/templates/anotados/New Format Resume Template.docx
+++ b/02-modulo2-agente-transformacion/microservicio/templates/anotados/New Format Resume Template.docx
@@ -158,7 +158,7 @@
     </w:p>
     <w:p>
       <w:pPr>
-        <w:spacing w:before="240" w:after="40"/>
+        <w:spacing w:before="240" w:after="0"/>
         <w:pBdr>
           <w:top w:val="single" w:sz="4" w:space="1" w:color="auto"/>
         </w:pBdr>
@@ -229,7 +229,7 @@
         <w:tabs>
           <w:tab w:pos="9360" w:val="right"/>
         </w:tabs>
-        <w:spacing w:after="0" w:before="120"/>
+        <w:spacing w:after="0" w:before="240"/>
         <w:ind w:left="0" w:firstLine="0"/>
         <w:keepNext/>
       </w:pPr>
@@ -254,6 +254,18 @@
     </w:p>
     <w:p>
       <w:pPr>
+        <w:pStyle w:val="CVControlTag"/>
+        <w:ind w:left="0" w:firstLine="0"/>
+      </w:pPr>
+      <w:r>
+        <w:t xml:space="preserve">{% if loop.first %}</w:t>
+      </w:r>
+    </w:p>
+    <w:p>
+      <w:pPr>
+        <w:tabs>
+          <w:tab w:val="right" w:pos="9360"/>
+        </w:tabs>
         <w:spacing w:after="0" w:before="0"/>
         <w:ind w:left="0" w:firstLine="0"/>
         <w:keepNext/>
@@ -271,6 +283,40 @@
         <w:ind w:left="0" w:firstLine="0"/>
       </w:pPr>
       <w:r>
+        <w:t xml:space="preserve">{% else %}</w:t>
+      </w:r>
+    </w:p>
+    <w:p>
+      <w:pPr>
+        <w:tabs>
+          <w:tab w:val="right" w:pos="9360"/>
+        </w:tabs>
+        <w:spacing w:after="0" w:before="120"/>
+        <w:ind w:left="0" w:firstLine="0"/>
+        <w:keepNext/>
+      </w:pPr>
+      <w:r>
+        <w:rPr>
+          <w:b/>
+        </w:rPr>
+        <w:t>{{ role.header }}</w:t>
+      </w:r>
+    </w:p>
+    <w:p>
+      <w:pPr>
+        <w:pStyle w:val="CVControlTag"/>
+        <w:ind w:left="0" w:firstLine="0"/>
+      </w:pPr>
+      <w:r>
+        <w:t xml:space="preserve">{% endif %}</w:t>
+      </w:r>
+    </w:p>
+    <w:p>
+      <w:pPr>
+        <w:pStyle w:val="CVControlTag"/>
+        <w:ind w:left="0" w:firstLine="0"/>
+      </w:pPr>
+      <w:r>
         <w:rPr>
           <w:b w:val="0"/>
         </w:rPr>
@@ -279,7 +325,7 @@
     </w:p>
     <w:p>
       <w:pPr>
-        <w:spacing w:after="0"/>
+        <w:spacing w:after="40"/>
         <w:ind w:left="720" w:hanging="360"/>
         <w:numPr>
           <w:ilvl w:val="0"/>
@@ -368,7 +414,7 @@
     </w:p>
     <w:p>
       <w:pPr>
-        <w:spacing w:after="0"/>
+        <w:spacing w:after="40"/>
         <w:ind w:left="720" w:hanging="360"/>
         <w:numPr>
           <w:ilvl w:val="0"/>
@@ -436,7 +482,7 @@
     </w:p>
     <w:p>
       <w:pPr>
-        <w:spacing w:after="0"/>
+        <w:spacing w:after="40"/>
         <w:ind w:left="720" w:hanging="360"/>
         <w:numPr>
           <w:ilvl w:val="0"/>
@@ -5275,6 +5321,9 @@
       <w:sz w:val="20"/>
       <w:szCs w:val="20"/>
     </w:rPr>
+    <w:pPr>
+      <w:spacing w:line="276" w:lineRule="auto"/>
+    </w:pPr>
   </w:style>
   <w:style w:type="paragraph" w:styleId="Heading1">
     <w:name w:val="heading 1"/>

</xml_diff>

<commit_message>
Portar fix de spacing doble a New Format y verificar los 3 formatos vía Microsoft Graph
- New Format: mismo bug de Non Template (SKILLS/CERTIFICATIONS con
  before=240/after=240 duplican el gap cuando la lista viene vacia) --
  corregido envolviendo titulo+loop en {% if %} por seccion.
- Verificacion real vía Microsoft Graph (content?format=pdf) de BD Format y
  Non Template, subiendo temporalmente los renders de prueba a SharePoint y
  borrandolos al cerrar -- confirma fuente, spacing y el fix de hoy en un PDF
  de produccion real, no solo estructura XML.
- 75 tests + smoke test 6/6 en verde. Los 3 formatos quedan sin bugs
  pendientes conocidos de layout.

Co-Authored-By: Claude Sonnet 5 <noreply@anthropic.com>
</commit_message>
<xml_diff>
--- a/02-modulo2-agente-transformacion/microservicio/templates/anotados/New Format Resume Template.docx
+++ b/02-modulo2-agente-transformacion/microservicio/templates/anotados/New Format Resume Template.docx
@@ -377,6 +377,18 @@
     </w:p>
     <w:p>
       <w:pPr>
+        <w:pStyle w:val="CVControlTag"/>
+        <w:ind w:left="0" w:firstLine="0"/>
+      </w:pPr>
+      <w:r>
+        <w:rPr>
+          <w:b w:val="0"/>
+        </w:rPr>
+        <w:t>{% if skills_items %}</w:t>
+      </w:r>
+    </w:p>
+    <w:p>
+      <w:pPr>
         <w:spacing w:before="240" w:after="240"/>
         <w:pBdr>
           <w:top w:val="single" w:sz="4" w:space="1" w:color="auto"/>
@@ -444,6 +456,30 @@
     </w:p>
     <w:p>
       <w:pPr>
+        <w:pStyle w:val="CVControlTag"/>
+        <w:ind w:left="0" w:firstLine="0"/>
+      </w:pPr>
+      <w:r>
+        <w:rPr>
+          <w:b w:val="0"/>
+        </w:rPr>
+        <w:t>{% endif %}</w:t>
+      </w:r>
+    </w:p>
+    <w:p>
+      <w:pPr>
+        <w:pStyle w:val="CVControlTag"/>
+        <w:ind w:left="0" w:firstLine="0"/>
+      </w:pPr>
+      <w:r>
+        <w:rPr>
+          <w:b w:val="0"/>
+        </w:rPr>
+        <w:t>{% if certifications_items %}</w:t>
+      </w:r>
+    </w:p>
+    <w:p>
+      <w:pPr>
         <w:spacing w:before="240" w:after="240"/>
         <w:pBdr>
           <w:top w:val="single" w:sz="4" w:space="1" w:color="auto"/>
@@ -508,6 +544,18 @@
           <w:b w:val="0"/>
         </w:rPr>
         <w:t>{% endfor %}</w:t>
+      </w:r>
+    </w:p>
+    <w:p>
+      <w:pPr>
+        <w:pStyle w:val="CVControlTag"/>
+        <w:ind w:left="0" w:firstLine="0"/>
+      </w:pPr>
+      <w:r>
+        <w:rPr>
+          <w:b w:val="0"/>
+        </w:rPr>
+        <w:t>{% endif %}</w:t>
       </w:r>
     </w:p>
     <w:sectPr>

</xml_diff>